<commit_message>
Uploaded Report and UML Diagrams
</commit_message>
<xml_diff>
--- a/Online Quiz App Report.docx
+++ b/Online Quiz App Report.docx
@@ -301,7 +301,7 @@
         <w:t xml:space="preserve"> </w:t>
       </w:r>
       <w:r>
-        <w:t>21CSC101T-Object Oriented Design                            and Programming.</w:t>
+        <w:t>21CSC101T</w:t>
       </w:r>
     </w:p>
     <w:p>
@@ -315,6 +315,20 @@
         <w:ind w:left="23" w:right="3694"/>
       </w:pPr>
       <w:r>
+        <w:t xml:space="preserve">                              (Object Oriented Design and Programming)</w:t>
+      </w:r>
+    </w:p>
+    <w:p>
+      <w:pPr>
+        <w:pStyle w:val="BodyText"/>
+        <w:tabs>
+          <w:tab w:val="left" w:pos="1463"/>
+          <w:tab w:val="left" w:pos="2184"/>
+        </w:tabs>
+        <w:spacing w:before="1" w:line="276" w:lineRule="auto"/>
+        <w:ind w:left="23" w:right="3694"/>
+      </w:pPr>
+      <w:r>
         <w:rPr>
           <w:spacing w:val="-2"/>
         </w:rPr>
@@ -324,7 +338,11 @@
         <w:tab/>
       </w:r>
       <w:r>
-        <w:t xml:space="preserve">            </w:t>
+        <w:t xml:space="preserve">          </w:t>
+      </w:r>
+      <w:proofErr w:type="gramStart"/>
+      <w:r>
+        <w:t xml:space="preserve">  </w:t>
       </w:r>
       <w:r>
         <w:rPr>
@@ -332,12 +350,14 @@
         </w:rPr>
         <w:t>:</w:t>
       </w:r>
+      <w:proofErr w:type="gramEnd"/>
       <w:r>
         <w:rPr>
           <w:spacing w:val="-10"/>
         </w:rPr>
         <w:t xml:space="preserve"> </w:t>
       </w:r>
+      <w:proofErr w:type="gramStart"/>
       <w:r>
         <w:rPr>
           <w:spacing w:val="-10"/>
@@ -348,7 +368,14 @@
         <w:rPr>
           <w:spacing w:val="-10"/>
         </w:rPr>
-        <w:t xml:space="preserve"> P SelvaMeena</w:t>
+        <w:t xml:space="preserve"> P</w:t>
+      </w:r>
+      <w:proofErr w:type="gramEnd"/>
+      <w:r>
+        <w:rPr>
+          <w:spacing w:val="-10"/>
+        </w:rPr>
+        <w:t xml:space="preserve"> SelvaMeena</w:t>
       </w:r>
     </w:p>
     <w:p>
@@ -527,7 +554,19 @@
         <w:rPr>
           <w:spacing w:val="-10"/>
         </w:rPr>
-        <w:t>/806</w:t>
+        <w:t>/</w:t>
+      </w:r>
+      <w:r>
+        <w:rPr>
+          <w:spacing w:val="-10"/>
+        </w:rPr>
+        <w:t>UB</w:t>
+      </w:r>
+      <w:r>
+        <w:rPr>
+          <w:spacing w:val="-10"/>
+        </w:rPr>
+        <w:t>806</w:t>
       </w:r>
     </w:p>
     <w:p>
@@ -1040,19 +1079,33 @@
         <w:rPr>
           <w:spacing w:val="-5"/>
         </w:rPr>
-        <w:t xml:space="preserve">Understand and apply core Object-Oriented Programming (OOP) concepts such as classes, objects, </w:t>
-      </w:r>
+        <w:t xml:space="preserve">Understand and apply core Object-Oriented Programming (OOP) concepts such as classes, </w:t>
+      </w:r>
+      <w:proofErr w:type="gramStart"/>
       <w:r>
         <w:rPr>
           <w:spacing w:val="-5"/>
         </w:rPr>
+        <w:t xml:space="preserve">objects, </w:t>
+      </w:r>
+      <w:r>
+        <w:rPr>
+          <w:spacing w:val="-5"/>
+        </w:rPr>
         <w:t xml:space="preserve"> </w:t>
       </w:r>
       <w:r>
         <w:rPr>
           <w:spacing w:val="-5"/>
         </w:rPr>
-        <w:t>encapsulation, and modular design.</w:t>
+        <w:t>encapsulation</w:t>
+      </w:r>
+      <w:proofErr w:type="gramEnd"/>
+      <w:r>
+        <w:rPr>
+          <w:spacing w:val="-5"/>
+        </w:rPr>
+        <w:t>, and modular design.</w:t>
       </w:r>
     </w:p>
     <w:p>
@@ -1488,7 +1541,15 @@
               <w:jc w:val="center"/>
             </w:pPr>
             <w:r>
-              <w:t>Ppt and Scripting</w:t>
+              <w:t xml:space="preserve">PPT </w:t>
+            </w:r>
+            <w:proofErr w:type="gramStart"/>
+            <w:r>
+              <w:t>Making ,</w:t>
+            </w:r>
+            <w:proofErr w:type="gramEnd"/>
+            <w:r>
+              <w:t xml:space="preserve"> Presentation </w:t>
             </w:r>
           </w:p>
         </w:tc>
@@ -1587,7 +1648,13 @@
               <w:jc w:val="center"/>
             </w:pPr>
             <w:r>
-              <w:t>Editor</w:t>
+              <w:t xml:space="preserve">Debugging </w:t>
+            </w:r>
+            <w:r>
+              <w:t xml:space="preserve">and </w:t>
+            </w:r>
+            <w:r>
+              <w:t xml:space="preserve">Report editing </w:t>
             </w:r>
           </w:p>
         </w:tc>
@@ -1686,7 +1753,7 @@
               <w:jc w:val="center"/>
             </w:pPr>
             <w:r>
-              <w:t>Reviewing</w:t>
+              <w:t xml:space="preserve">Speech and Presentation Preparation </w:t>
             </w:r>
           </w:p>
         </w:tc>
@@ -1785,8 +1852,13 @@
               <w:pStyle w:val="TableParagraph"/>
               <w:jc w:val="center"/>
             </w:pPr>
+            <w:proofErr w:type="spellStart"/>
             <w:r>
-              <w:t>Rehearsal management</w:t>
+              <w:t>Github</w:t>
+            </w:r>
+            <w:proofErr w:type="spellEnd"/>
+            <w:r>
+              <w:t xml:space="preserve"> Management </w:t>
             </w:r>
           </w:p>
         </w:tc>
@@ -1885,7 +1957,7 @@
               <w:jc w:val="center"/>
             </w:pPr>
             <w:r>
-              <w:t>Planning and Scripting</w:t>
+              <w:t>Report analysis</w:t>
             </w:r>
           </w:p>
         </w:tc>
@@ -1985,7 +2057,15 @@
               <w:jc w:val="center"/>
             </w:pPr>
             <w:r>
-              <w:t>Slide planning and report</w:t>
+              <w:t xml:space="preserve">Idea, </w:t>
+            </w:r>
+            <w:proofErr w:type="gramStart"/>
+            <w:r>
+              <w:t>Coding ,</w:t>
+            </w:r>
+            <w:proofErr w:type="gramEnd"/>
+            <w:r>
+              <w:t xml:space="preserve"> Report analysis and Ppt designing </w:t>
             </w:r>
           </w:p>
         </w:tc>
@@ -2083,15 +2163,20 @@
               <w:pStyle w:val="TableParagraph"/>
               <w:jc w:val="center"/>
             </w:pPr>
+            <w:proofErr w:type="gramStart"/>
             <w:r>
-              <w:t>Design, visuals and report</w:t>
+              <w:t>UML  Diagram</w:t>
+            </w:r>
+            <w:proofErr w:type="gramEnd"/>
+            <w:r>
+              <w:t xml:space="preserve"> Creation</w:t>
             </w:r>
           </w:p>
         </w:tc>
       </w:tr>
       <w:tr>
         <w:trPr>
-          <w:trHeight w:val="880"/>
+          <w:trHeight w:val="219"/>
         </w:trPr>
         <w:tc>
           <w:tcPr>
@@ -2100,29 +2185,10 @@
           <w:p>
             <w:pPr>
               <w:pStyle w:val="TableParagraph"/>
-              <w:spacing w:before="63"/>
-              <w:rPr>
-                <w:b/>
-                <w:sz w:val="21"/>
-              </w:rPr>
-            </w:pPr>
-          </w:p>
-          <w:p>
-            <w:pPr>
-              <w:pStyle w:val="TableParagraph"/>
-              <w:ind w:left="11"/>
-              <w:jc w:val="center"/>
               <w:rPr>
                 <w:sz w:val="21"/>
               </w:rPr>
             </w:pPr>
-            <w:r>
-              <w:rPr>
-                <w:spacing w:val="-10"/>
-                <w:sz w:val="21"/>
-              </w:rPr>
-              <w:t>8</w:t>
-            </w:r>
           </w:p>
         </w:tc>
         <w:tc>
@@ -2233,6 +2299,7 @@
         </w:rPr>
         <w:t xml:space="preserve"> </w:t>
       </w:r>
+      <w:proofErr w:type="gramStart"/>
       <w:r>
         <w:rPr>
           <w:sz w:val="24"/>
@@ -2252,6 +2319,7 @@
         </w:rPr>
         <w:t>]</w:t>
       </w:r>
+      <w:proofErr w:type="gramEnd"/>
       <w:r>
         <w:rPr>
           <w:spacing w:val="-15"/>
@@ -2259,6 +2327,7 @@
         </w:rPr>
         <w:t xml:space="preserve"> </w:t>
       </w:r>
+      <w:proofErr w:type="gramStart"/>
       <w:r>
         <w:rPr>
           <w:sz w:val="24"/>
@@ -2276,7 +2345,14 @@
         <w:rPr>
           <w:sz w:val="24"/>
         </w:rPr>
-        <w:t>[ ]</w:t>
+        <w:t>[</w:t>
+      </w:r>
+      <w:proofErr w:type="gramEnd"/>
+      <w:r>
+        <w:rPr>
+          <w:sz w:val="24"/>
+        </w:rPr>
+        <w:t xml:space="preserve"> ]</w:t>
       </w:r>
       <w:r>
         <w:rPr>
@@ -3361,7 +3437,23 @@
           <w:b/>
           <w:spacing w:val="-2"/>
         </w:rPr>
-        <w:t>class Question {   // Question Class</w:t>
+        <w:t xml:space="preserve">class Question </w:t>
+      </w:r>
+      <w:proofErr w:type="gramStart"/>
+      <w:r>
+        <w:rPr>
+          <w:b/>
+          <w:spacing w:val="-2"/>
+        </w:rPr>
+        <w:t xml:space="preserve">{  </w:t>
+      </w:r>
+      <w:proofErr w:type="gramEnd"/>
+      <w:r>
+        <w:rPr>
+          <w:b/>
+          <w:spacing w:val="-2"/>
+        </w:rPr>
+        <w:t xml:space="preserve"> // Question Class</w:t>
       </w:r>
     </w:p>
     <w:p>
@@ -3428,7 +3520,23 @@
           <w:b/>
           <w:spacing w:val="-2"/>
         </w:rPr>
-        <w:t xml:space="preserve">    string options[4];</w:t>
+        <w:t xml:space="preserve">    string </w:t>
+      </w:r>
+      <w:proofErr w:type="gramStart"/>
+      <w:r>
+        <w:rPr>
+          <w:b/>
+          <w:spacing w:val="-2"/>
+        </w:rPr>
+        <w:t>options[</w:t>
+      </w:r>
+      <w:proofErr w:type="gramEnd"/>
+      <w:r>
+        <w:rPr>
+          <w:b/>
+          <w:spacing w:val="-2"/>
+        </w:rPr>
+        <w:t>4];</w:t>
       </w:r>
     </w:p>
     <w:p>
@@ -3495,24 +3603,88 @@
           <w:b/>
           <w:spacing w:val="-2"/>
         </w:rPr>
-        <w:t xml:space="preserve">    Question() {}  // Default constructor</w:t>
-      </w:r>
-    </w:p>
-    <w:p>
-      <w:pPr>
-        <w:pStyle w:val="BodyText"/>
-        <w:spacing w:before="319"/>
-        <w:rPr>
-          <w:b/>
-          <w:spacing w:val="-2"/>
-        </w:rPr>
-      </w:pPr>
-      <w:r>
-        <w:rPr>
-          <w:b/>
-          <w:spacing w:val="-2"/>
-        </w:rPr>
-        <w:t xml:space="preserve">    Question(string q, string opt[], int </w:t>
+        <w:t xml:space="preserve">    </w:t>
+      </w:r>
+      <w:proofErr w:type="gramStart"/>
+      <w:r>
+        <w:rPr>
+          <w:b/>
+          <w:spacing w:val="-2"/>
+        </w:rPr>
+        <w:t>Question(</w:t>
+      </w:r>
+      <w:proofErr w:type="gramEnd"/>
+      <w:r>
+        <w:rPr>
+          <w:b/>
+          <w:spacing w:val="-2"/>
+        </w:rPr>
+        <w:t xml:space="preserve">) </w:t>
+      </w:r>
+      <w:proofErr w:type="gramStart"/>
+      <w:r>
+        <w:rPr>
+          <w:b/>
+          <w:spacing w:val="-2"/>
+        </w:rPr>
+        <w:t>{}  /</w:t>
+      </w:r>
+      <w:proofErr w:type="gramEnd"/>
+      <w:r>
+        <w:rPr>
+          <w:b/>
+          <w:spacing w:val="-2"/>
+        </w:rPr>
+        <w:t>/ Default constructor</w:t>
+      </w:r>
+    </w:p>
+    <w:p>
+      <w:pPr>
+        <w:pStyle w:val="BodyText"/>
+        <w:spacing w:before="319"/>
+        <w:rPr>
+          <w:b/>
+          <w:spacing w:val="-2"/>
+        </w:rPr>
+      </w:pPr>
+      <w:r>
+        <w:rPr>
+          <w:b/>
+          <w:spacing w:val="-2"/>
+        </w:rPr>
+        <w:t xml:space="preserve">    </w:t>
+      </w:r>
+      <w:proofErr w:type="gramStart"/>
+      <w:r>
+        <w:rPr>
+          <w:b/>
+          <w:spacing w:val="-2"/>
+        </w:rPr>
+        <w:t>Question(</w:t>
+      </w:r>
+      <w:proofErr w:type="gramEnd"/>
+      <w:r>
+        <w:rPr>
+          <w:b/>
+          <w:spacing w:val="-2"/>
+        </w:rPr>
+        <w:t xml:space="preserve">string q, string </w:t>
+      </w:r>
+      <w:proofErr w:type="gramStart"/>
+      <w:r>
+        <w:rPr>
+          <w:b/>
+          <w:spacing w:val="-2"/>
+        </w:rPr>
+        <w:t>opt[</w:t>
+      </w:r>
+      <w:proofErr w:type="gramEnd"/>
+      <w:r>
+        <w:rPr>
+          <w:b/>
+          <w:spacing w:val="-2"/>
+        </w:rPr>
+        <w:t xml:space="preserve">], int </w:t>
       </w:r>
       <w:proofErr w:type="spellStart"/>
       <w:r>
@@ -3786,7 +3958,23 @@
           <w:b/>
           <w:spacing w:val="-2"/>
         </w:rPr>
-        <w:t xml:space="preserve">    void display() {</w:t>
+        <w:t xml:space="preserve">    void </w:t>
+      </w:r>
+      <w:proofErr w:type="gramStart"/>
+      <w:r>
+        <w:rPr>
+          <w:b/>
+          <w:spacing w:val="-2"/>
+        </w:rPr>
+        <w:t>display(</w:t>
+      </w:r>
+      <w:proofErr w:type="gramEnd"/>
+      <w:r>
+        <w:rPr>
+          <w:b/>
+          <w:spacing w:val="-2"/>
+        </w:rPr>
+        <w:t>) {</w:t>
       </w:r>
     </w:p>
     <w:p>
@@ -4051,6 +4239,7 @@
         <w:t xml:space="preserve">    bool </w:t>
       </w:r>
       <w:proofErr w:type="spellStart"/>
+      <w:proofErr w:type="gramStart"/>
       <w:r>
         <w:rPr>
           <w:b/>
@@ -4064,7 +4253,15 @@
           <w:b/>
           <w:spacing w:val="-2"/>
         </w:rPr>
-        <w:t xml:space="preserve">(int </w:t>
+        <w:t>(</w:t>
+      </w:r>
+      <w:proofErr w:type="gramEnd"/>
+      <w:r>
+        <w:rPr>
+          <w:b/>
+          <w:spacing w:val="-2"/>
+        </w:rPr>
+        <w:t xml:space="preserve">int </w:t>
       </w:r>
       <w:proofErr w:type="spellStart"/>
       <w:r>
@@ -4180,7 +4377,23 @@
           <w:b/>
           <w:spacing w:val="-2"/>
         </w:rPr>
-        <w:t>class Quiz {    // Quiz Class</w:t>
+        <w:t xml:space="preserve">class Quiz </w:t>
+      </w:r>
+      <w:proofErr w:type="gramStart"/>
+      <w:r>
+        <w:rPr>
+          <w:b/>
+          <w:spacing w:val="-2"/>
+        </w:rPr>
+        <w:t xml:space="preserve">{  </w:t>
+      </w:r>
+      <w:proofErr w:type="gramEnd"/>
+      <w:r>
+        <w:rPr>
+          <w:b/>
+          <w:spacing w:val="-2"/>
+        </w:rPr>
+        <w:t xml:space="preserve">  // Quiz Class</w:t>
       </w:r>
     </w:p>
     <w:p>
@@ -4214,7 +4427,23 @@
           <w:b/>
           <w:spacing w:val="-2"/>
         </w:rPr>
-        <w:t xml:space="preserve">    Question questions[3];</w:t>
+        <w:t xml:space="preserve">    Question </w:t>
+      </w:r>
+      <w:proofErr w:type="gramStart"/>
+      <w:r>
+        <w:rPr>
+          <w:b/>
+          <w:spacing w:val="-2"/>
+        </w:rPr>
+        <w:t>questions[</w:t>
+      </w:r>
+      <w:proofErr w:type="gramEnd"/>
+      <w:r>
+        <w:rPr>
+          <w:b/>
+          <w:spacing w:val="-2"/>
+        </w:rPr>
+        <w:t>3];</w:t>
       </w:r>
     </w:p>
     <w:p>
@@ -4282,7 +4511,23 @@
           <w:b/>
           <w:spacing w:val="-2"/>
         </w:rPr>
-        <w:t xml:space="preserve">    Quiz() {</w:t>
+        <w:t xml:space="preserve">    </w:t>
+      </w:r>
+      <w:proofErr w:type="gramStart"/>
+      <w:r>
+        <w:rPr>
+          <w:b/>
+          <w:spacing w:val="-2"/>
+        </w:rPr>
+        <w:t>Quiz(</w:t>
+      </w:r>
+      <w:proofErr w:type="gramEnd"/>
+      <w:r>
+        <w:rPr>
+          <w:b/>
+          <w:spacing w:val="-2"/>
+        </w:rPr>
+        <w:t>) {</w:t>
       </w:r>
     </w:p>
     <w:p>
@@ -4364,6 +4609,7 @@
         <w:t xml:space="preserve">    void </w:t>
       </w:r>
       <w:proofErr w:type="spellStart"/>
+      <w:proofErr w:type="gramStart"/>
       <w:r>
         <w:rPr>
           <w:b/>
@@ -4377,7 +4623,15 @@
           <w:b/>
           <w:spacing w:val="-2"/>
         </w:rPr>
-        <w:t>(Question q) {</w:t>
+        <w:t>(</w:t>
+      </w:r>
+      <w:proofErr w:type="gramEnd"/>
+      <w:r>
+        <w:rPr>
+          <w:b/>
+          <w:spacing w:val="-2"/>
+        </w:rPr>
+        <w:t>Question q) {</w:t>
       </w:r>
     </w:p>
     <w:p>
@@ -4482,6 +4736,7 @@
         <w:t xml:space="preserve">    void </w:t>
       </w:r>
       <w:proofErr w:type="spellStart"/>
+      <w:proofErr w:type="gramStart"/>
       <w:r>
         <w:rPr>
           <w:b/>
@@ -4495,7 +4750,15 @@
           <w:b/>
           <w:spacing w:val="-2"/>
         </w:rPr>
-        <w:t>() {</w:t>
+        <w:t>(</w:t>
+      </w:r>
+      <w:proofErr w:type="gramEnd"/>
+      <w:r>
+        <w:rPr>
+          <w:b/>
+          <w:spacing w:val="-2"/>
+        </w:rPr>
+        <w:t>) {</w:t>
       </w:r>
     </w:p>
     <w:p>
@@ -4605,12 +4868,21 @@
         <w:t>i</w:t>
       </w:r>
       <w:proofErr w:type="spellEnd"/>
-      <w:r>
-        <w:rPr>
-          <w:b/>
-          <w:spacing w:val="-2"/>
-        </w:rPr>
-        <w:t>].display();</w:t>
+      <w:proofErr w:type="gramStart"/>
+      <w:r>
+        <w:rPr>
+          <w:b/>
+          <w:spacing w:val="-2"/>
+        </w:rPr>
+        <w:t>].display</w:t>
+      </w:r>
+      <w:proofErr w:type="gramEnd"/>
+      <w:r>
+        <w:rPr>
+          <w:b/>
+          <w:spacing w:val="-2"/>
+        </w:rPr>
+        <w:t>();</w:t>
       </w:r>
     </w:p>
     <w:p>
@@ -4704,6 +4976,7 @@
         <w:t>i</w:t>
       </w:r>
       <w:proofErr w:type="spellEnd"/>
+      <w:proofErr w:type="gramStart"/>
       <w:r>
         <w:rPr>
           <w:b/>
@@ -4720,6 +4993,7 @@
         <w:t>checkAnswer</w:t>
       </w:r>
       <w:proofErr w:type="spellEnd"/>
+      <w:proofErr w:type="gramEnd"/>
       <w:r>
         <w:rPr>
           <w:b/>
@@ -4758,7 +5032,23 @@
           <w:b/>
           <w:spacing w:val="-2"/>
         </w:rPr>
-        <w:t xml:space="preserve"> &lt;&lt; "Correct!\n";</w:t>
+        <w:t xml:space="preserve"> &lt;&lt; "</w:t>
+      </w:r>
+      <w:proofErr w:type="gramStart"/>
+      <w:r>
+        <w:rPr>
+          <w:b/>
+          <w:spacing w:val="-2"/>
+        </w:rPr>
+        <w:t>Correct!\</w:t>
+      </w:r>
+      <w:proofErr w:type="gramEnd"/>
+      <w:r>
+        <w:rPr>
+          <w:b/>
+          <w:spacing w:val="-2"/>
+        </w:rPr>
+        <w:t>n";</w:t>
       </w:r>
     </w:p>
     <w:p>
@@ -4825,7 +5115,23 @@
           <w:b/>
           <w:spacing w:val="-2"/>
         </w:rPr>
-        <w:t xml:space="preserve"> &lt;&lt; "Wrong!\n";</w:t>
+        <w:t xml:space="preserve"> &lt;&lt; "</w:t>
+      </w:r>
+      <w:proofErr w:type="gramStart"/>
+      <w:r>
+        <w:rPr>
+          <w:b/>
+          <w:spacing w:val="-2"/>
+        </w:rPr>
+        <w:t>Wrong!\</w:t>
+      </w:r>
+      <w:proofErr w:type="gramEnd"/>
+      <w:r>
+        <w:rPr>
+          <w:b/>
+          <w:spacing w:val="-2"/>
+        </w:rPr>
+        <w:t>n";</w:t>
       </w:r>
     </w:p>
     <w:p>
@@ -4896,6 +5202,7 @@
         <w:t xml:space="preserve">    void </w:t>
       </w:r>
       <w:proofErr w:type="spellStart"/>
+      <w:proofErr w:type="gramStart"/>
       <w:r>
         <w:rPr>
           <w:b/>
@@ -4909,7 +5216,15 @@
           <w:b/>
           <w:spacing w:val="-2"/>
         </w:rPr>
-        <w:t>() {</w:t>
+        <w:t>(</w:t>
+      </w:r>
+      <w:proofErr w:type="gramEnd"/>
+      <w:r>
+        <w:rPr>
+          <w:b/>
+          <w:spacing w:val="-2"/>
+        </w:rPr>
+        <w:t>) {</w:t>
       </w:r>
     </w:p>
     <w:p>
@@ -4984,13 +5299,78 @@
         <w:rPr>
           <w:b/>
           <w:spacing w:val="-2"/>
-        </w:rPr>
-      </w:pPr>
-      <w:r>
-        <w:rPr>
-          <w:b/>
-          <w:spacing w:val="-2"/>
-        </w:rPr>
+          <w:lang w:val="en-IN"/>
+        </w:rPr>
+      </w:pPr>
+      <w:r>
+        <w:rPr>
+          <w:b/>
+          <w:spacing w:val="-2"/>
+        </w:rPr>
+        <w:t xml:space="preserve">        </w:t>
+      </w:r>
+      <w:proofErr w:type="spellStart"/>
+      <w:r>
+        <w:rPr>
+          <w:b/>
+          <w:spacing w:val="-2"/>
+          <w:lang w:val="en-IN"/>
+        </w:rPr>
+        <w:t>cout</w:t>
+      </w:r>
+      <w:proofErr w:type="spellEnd"/>
+      <w:r>
+        <w:rPr>
+          <w:b/>
+          <w:spacing w:val="-2"/>
+          <w:lang w:val="en-IN"/>
+        </w:rPr>
+        <w:t xml:space="preserve"> &lt;&lt; "\n*********************************" &lt;&lt; </w:t>
+      </w:r>
+      <w:proofErr w:type="spellStart"/>
+      <w:r>
+        <w:rPr>
+          <w:b/>
+          <w:spacing w:val="-2"/>
+          <w:lang w:val="en-IN"/>
+        </w:rPr>
+        <w:t>endl</w:t>
+      </w:r>
+      <w:proofErr w:type="spellEnd"/>
+      <w:r>
+        <w:rPr>
+          <w:b/>
+          <w:spacing w:val="-2"/>
+          <w:lang w:val="en-IN"/>
+        </w:rPr>
+        <w:t>;</w:t>
+      </w:r>
+    </w:p>
+    <w:p>
+      <w:pPr>
+        <w:pStyle w:val="BodyText"/>
+        <w:spacing w:before="319"/>
+        <w:rPr>
+          <w:b/>
+          <w:spacing w:val="-2"/>
+        </w:rPr>
+      </w:pPr>
+    </w:p>
+    <w:p>
+      <w:pPr>
+        <w:pStyle w:val="BodyText"/>
+        <w:spacing w:before="319"/>
+        <w:rPr>
+          <w:b/>
+          <w:spacing w:val="-2"/>
+        </w:rPr>
+      </w:pPr>
+      <w:r>
+        <w:rPr>
+          <w:b/>
+          <w:spacing w:val="-2"/>
+        </w:rPr>
+        <w:lastRenderedPageBreak/>
         <w:t xml:space="preserve">    }</w:t>
       </w:r>
     </w:p>
@@ -5003,6 +5383,732 @@
           <w:spacing w:val="-2"/>
         </w:rPr>
       </w:pPr>
+      <w:r>
+        <w:rPr>
+          <w:b/>
+          <w:spacing w:val="-2"/>
+        </w:rPr>
+        <w:t>};</w:t>
+      </w:r>
+    </w:p>
+    <w:p>
+      <w:pPr>
+        <w:pStyle w:val="BodyText"/>
+        <w:spacing w:before="319"/>
+        <w:rPr>
+          <w:b/>
+          <w:spacing w:val="-2"/>
+        </w:rPr>
+      </w:pPr>
+      <w:r>
+        <w:rPr>
+          <w:b/>
+          <w:spacing w:val="-2"/>
+        </w:rPr>
+        <w:t xml:space="preserve">class User </w:t>
+      </w:r>
+      <w:proofErr w:type="gramStart"/>
+      <w:r>
+        <w:rPr>
+          <w:b/>
+          <w:spacing w:val="-2"/>
+        </w:rPr>
+        <w:t xml:space="preserve">{  </w:t>
+      </w:r>
+      <w:proofErr w:type="gramEnd"/>
+      <w:r>
+        <w:rPr>
+          <w:b/>
+          <w:spacing w:val="-2"/>
+        </w:rPr>
+        <w:t xml:space="preserve">  // User Class</w:t>
+      </w:r>
+    </w:p>
+    <w:p>
+      <w:pPr>
+        <w:pStyle w:val="BodyText"/>
+        <w:spacing w:before="319"/>
+        <w:rPr>
+          <w:b/>
+          <w:spacing w:val="-2"/>
+        </w:rPr>
+      </w:pPr>
+      <w:r>
+        <w:rPr>
+          <w:b/>
+          <w:spacing w:val="-2"/>
+        </w:rPr>
+        <w:t>private:</w:t>
+      </w:r>
+    </w:p>
+    <w:p>
+      <w:pPr>
+        <w:pStyle w:val="BodyText"/>
+        <w:spacing w:before="319"/>
+        <w:rPr>
+          <w:b/>
+          <w:spacing w:val="-2"/>
+        </w:rPr>
+      </w:pPr>
+      <w:r>
+        <w:rPr>
+          <w:b/>
+          <w:spacing w:val="-2"/>
+        </w:rPr>
+        <w:t xml:space="preserve">    string name;</w:t>
+      </w:r>
+    </w:p>
+    <w:p>
+      <w:pPr>
+        <w:pStyle w:val="BodyText"/>
+        <w:spacing w:before="319"/>
+        <w:rPr>
+          <w:b/>
+          <w:spacing w:val="-2"/>
+        </w:rPr>
+      </w:pPr>
+      <w:r>
+        <w:rPr>
+          <w:b/>
+          <w:spacing w:val="-2"/>
+        </w:rPr>
+        <w:t>public:</w:t>
+      </w:r>
+    </w:p>
+    <w:p>
+      <w:pPr>
+        <w:pStyle w:val="BodyText"/>
+        <w:spacing w:before="319"/>
+        <w:rPr>
+          <w:b/>
+          <w:spacing w:val="-2"/>
+        </w:rPr>
+      </w:pPr>
+      <w:r>
+        <w:rPr>
+          <w:b/>
+          <w:spacing w:val="-2"/>
+        </w:rPr>
+        <w:t xml:space="preserve">    void </w:t>
+      </w:r>
+      <w:proofErr w:type="gramStart"/>
+      <w:r>
+        <w:rPr>
+          <w:b/>
+          <w:spacing w:val="-2"/>
+        </w:rPr>
+        <w:t>start(</w:t>
+      </w:r>
+      <w:proofErr w:type="gramEnd"/>
+      <w:r>
+        <w:rPr>
+          <w:b/>
+          <w:spacing w:val="-2"/>
+        </w:rPr>
+        <w:t>) {</w:t>
+      </w:r>
+    </w:p>
+    <w:p>
+      <w:pPr>
+        <w:pStyle w:val="BodyText"/>
+        <w:spacing w:before="319"/>
+        <w:rPr>
+          <w:b/>
+          <w:spacing w:val="-2"/>
+          <w:lang w:val="en-IN"/>
+        </w:rPr>
+      </w:pPr>
+      <w:r>
+        <w:rPr>
+          <w:b/>
+          <w:spacing w:val="-2"/>
+        </w:rPr>
+        <w:t xml:space="preserve">        </w:t>
+      </w:r>
+      <w:proofErr w:type="spellStart"/>
+      <w:r>
+        <w:rPr>
+          <w:b/>
+          <w:spacing w:val="-2"/>
+          <w:lang w:val="en-IN"/>
+        </w:rPr>
+        <w:t>cout</w:t>
+      </w:r>
+      <w:proofErr w:type="spellEnd"/>
+      <w:r>
+        <w:rPr>
+          <w:b/>
+          <w:spacing w:val="-2"/>
+          <w:lang w:val="en-IN"/>
+        </w:rPr>
+        <w:t xml:space="preserve"> &lt;&lt; "\n*********************************" &lt;&lt; </w:t>
+      </w:r>
+      <w:proofErr w:type="spellStart"/>
+      <w:r>
+        <w:rPr>
+          <w:b/>
+          <w:spacing w:val="-2"/>
+          <w:lang w:val="en-IN"/>
+        </w:rPr>
+        <w:t>endl</w:t>
+      </w:r>
+      <w:proofErr w:type="spellEnd"/>
+      <w:r>
+        <w:rPr>
+          <w:b/>
+          <w:spacing w:val="-2"/>
+          <w:lang w:val="en-IN"/>
+        </w:rPr>
+        <w:t>;</w:t>
+      </w:r>
+    </w:p>
+    <w:p>
+      <w:pPr>
+        <w:pStyle w:val="BodyText"/>
+        <w:spacing w:before="319"/>
+        <w:rPr>
+          <w:b/>
+          <w:spacing w:val="-2"/>
+        </w:rPr>
+      </w:pPr>
+      <w:r>
+        <w:rPr>
+          <w:b/>
+          <w:spacing w:val="-2"/>
+        </w:rPr>
+        <w:t xml:space="preserve">        </w:t>
+      </w:r>
+      <w:proofErr w:type="spellStart"/>
+      <w:r>
+        <w:rPr>
+          <w:b/>
+          <w:spacing w:val="-2"/>
+        </w:rPr>
+        <w:t>cout</w:t>
+      </w:r>
+      <w:proofErr w:type="spellEnd"/>
+      <w:r>
+        <w:rPr>
+          <w:b/>
+          <w:spacing w:val="-2"/>
+        </w:rPr>
+        <w:t xml:space="preserve"> &lt;&lt; "Enter your name: ";</w:t>
+      </w:r>
+    </w:p>
+    <w:p>
+      <w:pPr>
+        <w:pStyle w:val="BodyText"/>
+        <w:spacing w:before="319"/>
+        <w:rPr>
+          <w:b/>
+          <w:spacing w:val="-2"/>
+        </w:rPr>
+      </w:pPr>
+      <w:r>
+        <w:rPr>
+          <w:b/>
+          <w:spacing w:val="-2"/>
+        </w:rPr>
+        <w:t xml:space="preserve">        </w:t>
+      </w:r>
+      <w:proofErr w:type="spellStart"/>
+      <w:r>
+        <w:rPr>
+          <w:b/>
+          <w:spacing w:val="-2"/>
+        </w:rPr>
+        <w:t>cin</w:t>
+      </w:r>
+      <w:proofErr w:type="spellEnd"/>
+      <w:r>
+        <w:rPr>
+          <w:b/>
+          <w:spacing w:val="-2"/>
+        </w:rPr>
+        <w:t xml:space="preserve"> &gt;&gt; name;</w:t>
+      </w:r>
+    </w:p>
+    <w:p>
+      <w:pPr>
+        <w:pStyle w:val="BodyText"/>
+        <w:spacing w:before="319"/>
+        <w:rPr>
+          <w:b/>
+          <w:spacing w:val="-2"/>
+        </w:rPr>
+      </w:pPr>
+      <w:r>
+        <w:rPr>
+          <w:b/>
+          <w:spacing w:val="-2"/>
+        </w:rPr>
+        <w:t xml:space="preserve">        Quiz </w:t>
+      </w:r>
+      <w:proofErr w:type="spellStart"/>
+      <w:r>
+        <w:rPr>
+          <w:b/>
+          <w:spacing w:val="-2"/>
+        </w:rPr>
+        <w:t>quiz</w:t>
+      </w:r>
+      <w:proofErr w:type="spellEnd"/>
+      <w:r>
+        <w:rPr>
+          <w:b/>
+          <w:spacing w:val="-2"/>
+        </w:rPr>
+        <w:t>;</w:t>
+      </w:r>
+    </w:p>
+    <w:p>
+      <w:pPr>
+        <w:pStyle w:val="BodyText"/>
+        <w:spacing w:before="319"/>
+        <w:rPr>
+          <w:b/>
+          <w:spacing w:val="-2"/>
+        </w:rPr>
+      </w:pPr>
+      <w:r>
+        <w:rPr>
+          <w:b/>
+          <w:spacing w:val="-2"/>
+        </w:rPr>
+        <w:t xml:space="preserve">        string opt1[] = {"Paris", "London", "Berlin", "Rome"};</w:t>
+      </w:r>
+    </w:p>
+    <w:p>
+      <w:pPr>
+        <w:pStyle w:val="BodyText"/>
+        <w:spacing w:before="319"/>
+        <w:rPr>
+          <w:b/>
+          <w:spacing w:val="-2"/>
+        </w:rPr>
+      </w:pPr>
+      <w:r>
+        <w:rPr>
+          <w:b/>
+          <w:spacing w:val="-2"/>
+        </w:rPr>
+        <w:t xml:space="preserve">        </w:t>
+      </w:r>
+      <w:proofErr w:type="spellStart"/>
+      <w:proofErr w:type="gramStart"/>
+      <w:r>
+        <w:rPr>
+          <w:b/>
+          <w:spacing w:val="-2"/>
+        </w:rPr>
+        <w:t>quiz.addQuestion</w:t>
+      </w:r>
+      <w:proofErr w:type="spellEnd"/>
+      <w:proofErr w:type="gramEnd"/>
+      <w:r>
+        <w:rPr>
+          <w:b/>
+          <w:spacing w:val="-2"/>
+        </w:rPr>
+        <w:t>(</w:t>
+      </w:r>
+      <w:proofErr w:type="gramStart"/>
+      <w:r>
+        <w:rPr>
+          <w:b/>
+          <w:spacing w:val="-2"/>
+        </w:rPr>
+        <w:t>Question(</w:t>
+      </w:r>
+      <w:proofErr w:type="gramEnd"/>
+      <w:r>
+        <w:rPr>
+          <w:b/>
+          <w:spacing w:val="-2"/>
+        </w:rPr>
+        <w:t>"What is the capital of France?", opt1, 1));</w:t>
+      </w:r>
+    </w:p>
+    <w:p>
+      <w:pPr>
+        <w:pStyle w:val="BodyText"/>
+        <w:spacing w:before="319"/>
+        <w:rPr>
+          <w:b/>
+          <w:spacing w:val="-2"/>
+        </w:rPr>
+      </w:pPr>
+      <w:r>
+        <w:rPr>
+          <w:b/>
+          <w:spacing w:val="-2"/>
+        </w:rPr>
+        <w:t xml:space="preserve">        string opt2[] = {"3", "4", "5", "6"};</w:t>
+      </w:r>
+    </w:p>
+    <w:p>
+      <w:pPr>
+        <w:pStyle w:val="BodyText"/>
+        <w:spacing w:before="319"/>
+        <w:rPr>
+          <w:b/>
+          <w:spacing w:val="-2"/>
+        </w:rPr>
+      </w:pPr>
+      <w:r>
+        <w:rPr>
+          <w:b/>
+          <w:spacing w:val="-2"/>
+        </w:rPr>
+        <w:t xml:space="preserve">        quiz</w:t>
+      </w:r>
+      <w:r>
+        <w:rPr>
+          <w:b/>
+          <w:spacing w:val="-2"/>
+        </w:rPr>
+        <w:t xml:space="preserve"> </w:t>
+      </w:r>
+      <w:proofErr w:type="spellStart"/>
+      <w:proofErr w:type="gramStart"/>
+      <w:r>
+        <w:rPr>
+          <w:b/>
+          <w:spacing w:val="-2"/>
+        </w:rPr>
+        <w:t>addQuestion</w:t>
+      </w:r>
+      <w:proofErr w:type="spellEnd"/>
+      <w:r>
+        <w:rPr>
+          <w:b/>
+          <w:spacing w:val="-2"/>
+        </w:rPr>
+        <w:t>(Question(</w:t>
+      </w:r>
+      <w:proofErr w:type="gramEnd"/>
+      <w:r>
+        <w:rPr>
+          <w:b/>
+          <w:spacing w:val="-2"/>
+        </w:rPr>
+        <w:t xml:space="preserve">"2 + 2 </w:t>
+      </w:r>
+      <w:proofErr w:type="gramStart"/>
+      <w:r>
+        <w:rPr>
+          <w:b/>
+          <w:spacing w:val="-2"/>
+        </w:rPr>
+        <w:t>= ?</w:t>
+      </w:r>
+      <w:proofErr w:type="gramEnd"/>
+      <w:r>
+        <w:rPr>
+          <w:b/>
+          <w:spacing w:val="-2"/>
+        </w:rPr>
+        <w:t>", opt2, 2));</w:t>
+      </w:r>
+    </w:p>
+    <w:p>
+      <w:pPr>
+        <w:pStyle w:val="BodyText"/>
+        <w:spacing w:before="319"/>
+        <w:rPr>
+          <w:b/>
+          <w:spacing w:val="-2"/>
+        </w:rPr>
+      </w:pPr>
+      <w:r>
+        <w:rPr>
+          <w:b/>
+          <w:spacing w:val="-2"/>
+        </w:rPr>
+        <w:t xml:space="preserve">        string opt3[] = {"Earth", "Mars", "Jupiter", "Saturn"};</w:t>
+      </w:r>
+    </w:p>
+    <w:p>
+      <w:pPr>
+        <w:pStyle w:val="BodyText"/>
+        <w:spacing w:before="319"/>
+        <w:rPr>
+          <w:b/>
+          <w:spacing w:val="-2"/>
+        </w:rPr>
+      </w:pPr>
+      <w:r>
+        <w:rPr>
+          <w:b/>
+          <w:spacing w:val="-2"/>
+        </w:rPr>
+        <w:t xml:space="preserve">        </w:t>
+      </w:r>
+      <w:proofErr w:type="spellStart"/>
+      <w:proofErr w:type="gramStart"/>
+      <w:r>
+        <w:rPr>
+          <w:b/>
+          <w:spacing w:val="-2"/>
+        </w:rPr>
+        <w:t>quiz.addQuestion</w:t>
+      </w:r>
+      <w:proofErr w:type="spellEnd"/>
+      <w:proofErr w:type="gramEnd"/>
+      <w:r>
+        <w:rPr>
+          <w:b/>
+          <w:spacing w:val="-2"/>
+        </w:rPr>
+        <w:t>(</w:t>
+      </w:r>
+      <w:proofErr w:type="gramStart"/>
+      <w:r>
+        <w:rPr>
+          <w:b/>
+          <w:spacing w:val="-2"/>
+        </w:rPr>
+        <w:t>Question(</w:t>
+      </w:r>
+      <w:proofErr w:type="gramEnd"/>
+      <w:r>
+        <w:rPr>
+          <w:b/>
+          <w:spacing w:val="-2"/>
+        </w:rPr>
+        <w:t>"Largest planet?", opt3, 3));</w:t>
+      </w:r>
+    </w:p>
+    <w:p>
+      <w:pPr>
+        <w:pStyle w:val="BodyText"/>
+        <w:spacing w:before="319"/>
+        <w:rPr>
+          <w:b/>
+          <w:spacing w:val="-2"/>
+        </w:rPr>
+      </w:pPr>
+      <w:r>
+        <w:rPr>
+          <w:b/>
+          <w:spacing w:val="-2"/>
+        </w:rPr>
+        <w:t xml:space="preserve">        </w:t>
+      </w:r>
+      <w:proofErr w:type="spellStart"/>
+      <w:proofErr w:type="gramStart"/>
+      <w:r>
+        <w:rPr>
+          <w:b/>
+          <w:spacing w:val="-2"/>
+        </w:rPr>
+        <w:t>quiz.startQuiz</w:t>
+      </w:r>
+      <w:proofErr w:type="spellEnd"/>
+      <w:proofErr w:type="gramEnd"/>
+      <w:r>
+        <w:rPr>
+          <w:b/>
+          <w:spacing w:val="-2"/>
+        </w:rPr>
+        <w:t>();</w:t>
+      </w:r>
+    </w:p>
+    <w:p>
+      <w:pPr>
+        <w:pStyle w:val="BodyText"/>
+        <w:spacing w:before="319"/>
+        <w:rPr>
+          <w:b/>
+          <w:spacing w:val="-2"/>
+        </w:rPr>
+      </w:pPr>
+      <w:r>
+        <w:rPr>
+          <w:b/>
+          <w:spacing w:val="-2"/>
+        </w:rPr>
+        <w:t xml:space="preserve">        </w:t>
+      </w:r>
+      <w:proofErr w:type="spellStart"/>
+      <w:proofErr w:type="gramStart"/>
+      <w:r>
+        <w:rPr>
+          <w:b/>
+          <w:spacing w:val="-2"/>
+        </w:rPr>
+        <w:t>quiz.showResult</w:t>
+      </w:r>
+      <w:proofErr w:type="spellEnd"/>
+      <w:proofErr w:type="gramEnd"/>
+      <w:r>
+        <w:rPr>
+          <w:b/>
+          <w:spacing w:val="-2"/>
+        </w:rPr>
+        <w:t>();</w:t>
+      </w:r>
+    </w:p>
+    <w:p>
+      <w:pPr>
+        <w:pStyle w:val="BodyText"/>
+        <w:spacing w:before="319"/>
+        <w:rPr>
+          <w:b/>
+          <w:spacing w:val="-2"/>
+        </w:rPr>
+      </w:pPr>
+      <w:r>
+        <w:rPr>
+          <w:b/>
+          <w:spacing w:val="-2"/>
+        </w:rPr>
+        <w:t xml:space="preserve">    }</w:t>
+      </w:r>
+    </w:p>
+    <w:p>
+      <w:pPr>
+        <w:pStyle w:val="BodyText"/>
+        <w:spacing w:before="319"/>
+        <w:rPr>
+          <w:b/>
+          <w:spacing w:val="-2"/>
+        </w:rPr>
+      </w:pPr>
+      <w:r>
+        <w:rPr>
+          <w:b/>
+          <w:spacing w:val="-2"/>
+        </w:rPr>
+        <w:t>};</w:t>
+      </w:r>
+    </w:p>
+    <w:p>
+      <w:pPr>
+        <w:pStyle w:val="BodyText"/>
+        <w:spacing w:before="319"/>
+        <w:rPr>
+          <w:b/>
+          <w:spacing w:val="-2"/>
+        </w:rPr>
+      </w:pPr>
+      <w:r>
+        <w:rPr>
+          <w:b/>
+          <w:spacing w:val="-2"/>
+        </w:rPr>
+        <w:t xml:space="preserve">int </w:t>
+      </w:r>
+      <w:proofErr w:type="gramStart"/>
+      <w:r>
+        <w:rPr>
+          <w:b/>
+          <w:spacing w:val="-2"/>
+        </w:rPr>
+        <w:t>main(</w:t>
+      </w:r>
+      <w:proofErr w:type="gramEnd"/>
+      <w:r>
+        <w:rPr>
+          <w:b/>
+          <w:spacing w:val="-2"/>
+        </w:rPr>
+        <w:t xml:space="preserve">) </w:t>
+      </w:r>
+      <w:proofErr w:type="gramStart"/>
+      <w:r>
+        <w:rPr>
+          <w:b/>
+          <w:spacing w:val="-2"/>
+        </w:rPr>
+        <w:t>{  /</w:t>
+      </w:r>
+      <w:proofErr w:type="gramEnd"/>
+      <w:r>
+        <w:rPr>
+          <w:b/>
+          <w:spacing w:val="-2"/>
+        </w:rPr>
+        <w:t>/ Main Function</w:t>
+      </w:r>
+    </w:p>
+    <w:p>
+      <w:pPr>
+        <w:pStyle w:val="BodyText"/>
+        <w:spacing w:before="319"/>
+        <w:rPr>
+          <w:b/>
+          <w:spacing w:val="-2"/>
+        </w:rPr>
+      </w:pPr>
+      <w:r>
+        <w:rPr>
+          <w:b/>
+          <w:spacing w:val="-2"/>
+        </w:rPr>
+        <w:t xml:space="preserve">    User </w:t>
+      </w:r>
+      <w:proofErr w:type="spellStart"/>
+      <w:r>
+        <w:rPr>
+          <w:b/>
+          <w:spacing w:val="-2"/>
+        </w:rPr>
+        <w:t>user</w:t>
+      </w:r>
+      <w:proofErr w:type="spellEnd"/>
+      <w:r>
+        <w:rPr>
+          <w:b/>
+          <w:spacing w:val="-2"/>
+        </w:rPr>
+        <w:t>;</w:t>
+      </w:r>
+    </w:p>
+    <w:p>
+      <w:pPr>
+        <w:pStyle w:val="BodyText"/>
+        <w:spacing w:before="319"/>
+        <w:rPr>
+          <w:b/>
+          <w:spacing w:val="-2"/>
+        </w:rPr>
+      </w:pPr>
+      <w:r>
+        <w:rPr>
+          <w:b/>
+          <w:spacing w:val="-2"/>
+        </w:rPr>
+        <w:t xml:space="preserve">    </w:t>
+      </w:r>
+      <w:proofErr w:type="spellStart"/>
+      <w:proofErr w:type="gramStart"/>
+      <w:r>
+        <w:rPr>
+          <w:b/>
+          <w:spacing w:val="-2"/>
+        </w:rPr>
+        <w:t>user.start</w:t>
+      </w:r>
+      <w:proofErr w:type="spellEnd"/>
+      <w:proofErr w:type="gramEnd"/>
+      <w:r>
+        <w:rPr>
+          <w:b/>
+          <w:spacing w:val="-2"/>
+        </w:rPr>
+        <w:t>();</w:t>
+      </w:r>
+    </w:p>
+    <w:p>
+      <w:pPr>
+        <w:pStyle w:val="BodyText"/>
+        <w:spacing w:before="319"/>
+        <w:rPr>
+          <w:b/>
+          <w:spacing w:val="-2"/>
+        </w:rPr>
+      </w:pPr>
     </w:p>
     <w:p>
       <w:pPr>
@@ -5019,547 +6125,6 @@
           <w:spacing w:val="-2"/>
         </w:rPr>
         <w:lastRenderedPageBreak/>
-        <w:t>};</w:t>
-      </w:r>
-    </w:p>
-    <w:p>
-      <w:pPr>
-        <w:pStyle w:val="BodyText"/>
-        <w:spacing w:before="319"/>
-        <w:rPr>
-          <w:b/>
-          <w:spacing w:val="-2"/>
-        </w:rPr>
-      </w:pPr>
-      <w:r>
-        <w:rPr>
-          <w:b/>
-          <w:spacing w:val="-2"/>
-        </w:rPr>
-        <w:t>class User {    // User Class</w:t>
-      </w:r>
-    </w:p>
-    <w:p>
-      <w:pPr>
-        <w:pStyle w:val="BodyText"/>
-        <w:spacing w:before="319"/>
-        <w:rPr>
-          <w:b/>
-          <w:spacing w:val="-2"/>
-        </w:rPr>
-      </w:pPr>
-      <w:r>
-        <w:rPr>
-          <w:b/>
-          <w:spacing w:val="-2"/>
-        </w:rPr>
-        <w:t>private:</w:t>
-      </w:r>
-    </w:p>
-    <w:p>
-      <w:pPr>
-        <w:pStyle w:val="BodyText"/>
-        <w:spacing w:before="319"/>
-        <w:rPr>
-          <w:b/>
-          <w:spacing w:val="-2"/>
-        </w:rPr>
-      </w:pPr>
-      <w:r>
-        <w:rPr>
-          <w:b/>
-          <w:spacing w:val="-2"/>
-        </w:rPr>
-        <w:t xml:space="preserve">    string name;</w:t>
-      </w:r>
-    </w:p>
-    <w:p>
-      <w:pPr>
-        <w:pStyle w:val="BodyText"/>
-        <w:spacing w:before="319"/>
-        <w:rPr>
-          <w:b/>
-          <w:spacing w:val="-2"/>
-        </w:rPr>
-      </w:pPr>
-      <w:r>
-        <w:rPr>
-          <w:b/>
-          <w:spacing w:val="-2"/>
-        </w:rPr>
-        <w:t>public:</w:t>
-      </w:r>
-    </w:p>
-    <w:p>
-      <w:pPr>
-        <w:pStyle w:val="BodyText"/>
-        <w:spacing w:before="319"/>
-        <w:rPr>
-          <w:b/>
-          <w:spacing w:val="-2"/>
-        </w:rPr>
-      </w:pPr>
-      <w:r>
-        <w:rPr>
-          <w:b/>
-          <w:spacing w:val="-2"/>
-        </w:rPr>
-        <w:t xml:space="preserve">    void start() {</w:t>
-      </w:r>
-    </w:p>
-    <w:p>
-      <w:pPr>
-        <w:pStyle w:val="BodyText"/>
-        <w:spacing w:before="319"/>
-        <w:rPr>
-          <w:b/>
-          <w:spacing w:val="-2"/>
-        </w:rPr>
-      </w:pPr>
-      <w:r>
-        <w:rPr>
-          <w:b/>
-          <w:spacing w:val="-2"/>
-        </w:rPr>
-        <w:t xml:space="preserve">        </w:t>
-      </w:r>
-      <w:proofErr w:type="spellStart"/>
-      <w:r>
-        <w:rPr>
-          <w:b/>
-          <w:spacing w:val="-2"/>
-        </w:rPr>
-        <w:t>cout</w:t>
-      </w:r>
-      <w:proofErr w:type="spellEnd"/>
-      <w:r>
-        <w:rPr>
-          <w:b/>
-          <w:spacing w:val="-2"/>
-        </w:rPr>
-        <w:t xml:space="preserve"> &lt;&lt; "Enter your name: ";</w:t>
-      </w:r>
-    </w:p>
-    <w:p>
-      <w:pPr>
-        <w:pStyle w:val="BodyText"/>
-        <w:spacing w:before="319"/>
-        <w:rPr>
-          <w:b/>
-          <w:spacing w:val="-2"/>
-        </w:rPr>
-      </w:pPr>
-      <w:r>
-        <w:rPr>
-          <w:b/>
-          <w:spacing w:val="-2"/>
-        </w:rPr>
-        <w:t xml:space="preserve">        </w:t>
-      </w:r>
-      <w:proofErr w:type="spellStart"/>
-      <w:r>
-        <w:rPr>
-          <w:b/>
-          <w:spacing w:val="-2"/>
-        </w:rPr>
-        <w:t>cin</w:t>
-      </w:r>
-      <w:proofErr w:type="spellEnd"/>
-      <w:r>
-        <w:rPr>
-          <w:b/>
-          <w:spacing w:val="-2"/>
-        </w:rPr>
-        <w:t xml:space="preserve"> &gt;&gt; name;</w:t>
-      </w:r>
-    </w:p>
-    <w:p>
-      <w:pPr>
-        <w:pStyle w:val="BodyText"/>
-        <w:spacing w:before="319"/>
-        <w:rPr>
-          <w:b/>
-          <w:spacing w:val="-2"/>
-        </w:rPr>
-      </w:pPr>
-      <w:r>
-        <w:rPr>
-          <w:b/>
-          <w:spacing w:val="-2"/>
-        </w:rPr>
-        <w:t xml:space="preserve">        Quiz </w:t>
-      </w:r>
-      <w:proofErr w:type="spellStart"/>
-      <w:r>
-        <w:rPr>
-          <w:b/>
-          <w:spacing w:val="-2"/>
-        </w:rPr>
-        <w:t>quiz</w:t>
-      </w:r>
-      <w:proofErr w:type="spellEnd"/>
-      <w:r>
-        <w:rPr>
-          <w:b/>
-          <w:spacing w:val="-2"/>
-        </w:rPr>
-        <w:t>;</w:t>
-      </w:r>
-    </w:p>
-    <w:p>
-      <w:pPr>
-        <w:pStyle w:val="BodyText"/>
-        <w:spacing w:before="319"/>
-        <w:rPr>
-          <w:b/>
-          <w:spacing w:val="-2"/>
-        </w:rPr>
-      </w:pPr>
-      <w:r>
-        <w:rPr>
-          <w:b/>
-          <w:spacing w:val="-2"/>
-        </w:rPr>
-        <w:t xml:space="preserve">        string opt1[] = {"Paris", "London", "Berlin", "Rome"};</w:t>
-      </w:r>
-    </w:p>
-    <w:p>
-      <w:pPr>
-        <w:pStyle w:val="BodyText"/>
-        <w:spacing w:before="319"/>
-        <w:rPr>
-          <w:b/>
-          <w:spacing w:val="-2"/>
-        </w:rPr>
-      </w:pPr>
-      <w:r>
-        <w:rPr>
-          <w:b/>
-          <w:spacing w:val="-2"/>
-        </w:rPr>
-        <w:t xml:space="preserve">        </w:t>
-      </w:r>
-      <w:proofErr w:type="spellStart"/>
-      <w:r>
-        <w:rPr>
-          <w:b/>
-          <w:spacing w:val="-2"/>
-        </w:rPr>
-        <w:t>quiz.addQuestion</w:t>
-      </w:r>
-      <w:proofErr w:type="spellEnd"/>
-      <w:r>
-        <w:rPr>
-          <w:b/>
-          <w:spacing w:val="-2"/>
-        </w:rPr>
-        <w:t>(Question("What is the capital of France?", opt1, 1));</w:t>
-      </w:r>
-    </w:p>
-    <w:p>
-      <w:pPr>
-        <w:pStyle w:val="BodyText"/>
-        <w:spacing w:before="319"/>
-        <w:rPr>
-          <w:b/>
-          <w:spacing w:val="-2"/>
-        </w:rPr>
-      </w:pPr>
-      <w:r>
-        <w:rPr>
-          <w:b/>
-          <w:spacing w:val="-2"/>
-        </w:rPr>
-        <w:t xml:space="preserve">        string opt2[] = {"3", "4", "5", "6"};</w:t>
-      </w:r>
-    </w:p>
-    <w:p>
-      <w:pPr>
-        <w:pStyle w:val="BodyText"/>
-        <w:spacing w:before="319"/>
-        <w:rPr>
-          <w:b/>
-          <w:spacing w:val="-2"/>
-        </w:rPr>
-      </w:pPr>
-      <w:r>
-        <w:rPr>
-          <w:b/>
-          <w:spacing w:val="-2"/>
-        </w:rPr>
-        <w:t xml:space="preserve">        quiz</w:t>
-      </w:r>
-      <w:r>
-        <w:rPr>
-          <w:b/>
-          <w:spacing w:val="-2"/>
-        </w:rPr>
-        <w:t xml:space="preserve"> </w:t>
-      </w:r>
-      <w:proofErr w:type="spellStart"/>
-      <w:r>
-        <w:rPr>
-          <w:b/>
-          <w:spacing w:val="-2"/>
-        </w:rPr>
-        <w:t>addQuestion</w:t>
-      </w:r>
-      <w:proofErr w:type="spellEnd"/>
-      <w:r>
-        <w:rPr>
-          <w:b/>
-          <w:spacing w:val="-2"/>
-        </w:rPr>
-        <w:t>(Question("2 + 2 = ?", opt2, 2));</w:t>
-      </w:r>
-    </w:p>
-    <w:p>
-      <w:pPr>
-        <w:pStyle w:val="BodyText"/>
-        <w:spacing w:before="319"/>
-        <w:rPr>
-          <w:b/>
-          <w:spacing w:val="-2"/>
-        </w:rPr>
-      </w:pPr>
-      <w:r>
-        <w:rPr>
-          <w:b/>
-          <w:spacing w:val="-2"/>
-        </w:rPr>
-        <w:t xml:space="preserve">        string opt3[] = {"Earth", "Mars", "Jupiter", "Saturn"};</w:t>
-      </w:r>
-    </w:p>
-    <w:p>
-      <w:pPr>
-        <w:pStyle w:val="BodyText"/>
-        <w:spacing w:before="319"/>
-        <w:rPr>
-          <w:b/>
-          <w:spacing w:val="-2"/>
-        </w:rPr>
-      </w:pPr>
-      <w:r>
-        <w:rPr>
-          <w:b/>
-          <w:spacing w:val="-2"/>
-        </w:rPr>
-        <w:t xml:space="preserve">        </w:t>
-      </w:r>
-      <w:proofErr w:type="spellStart"/>
-      <w:r>
-        <w:rPr>
-          <w:b/>
-          <w:spacing w:val="-2"/>
-        </w:rPr>
-        <w:t>quiz.addQuestion</w:t>
-      </w:r>
-      <w:proofErr w:type="spellEnd"/>
-      <w:r>
-        <w:rPr>
-          <w:b/>
-          <w:spacing w:val="-2"/>
-        </w:rPr>
-        <w:t>(Question("Largest planet?", opt3, 3));</w:t>
-      </w:r>
-    </w:p>
-    <w:p>
-      <w:pPr>
-        <w:pStyle w:val="BodyText"/>
-        <w:spacing w:before="319"/>
-        <w:rPr>
-          <w:b/>
-          <w:spacing w:val="-2"/>
-        </w:rPr>
-      </w:pPr>
-      <w:r>
-        <w:rPr>
-          <w:b/>
-          <w:spacing w:val="-2"/>
-        </w:rPr>
-        <w:t xml:space="preserve">        </w:t>
-      </w:r>
-      <w:proofErr w:type="spellStart"/>
-      <w:r>
-        <w:rPr>
-          <w:b/>
-          <w:spacing w:val="-2"/>
-        </w:rPr>
-        <w:t>quiz.startQuiz</w:t>
-      </w:r>
-      <w:proofErr w:type="spellEnd"/>
-      <w:r>
-        <w:rPr>
-          <w:b/>
-          <w:spacing w:val="-2"/>
-        </w:rPr>
-        <w:t>();</w:t>
-      </w:r>
-    </w:p>
-    <w:p>
-      <w:pPr>
-        <w:pStyle w:val="BodyText"/>
-        <w:spacing w:before="319"/>
-        <w:rPr>
-          <w:b/>
-          <w:spacing w:val="-2"/>
-        </w:rPr>
-      </w:pPr>
-      <w:r>
-        <w:rPr>
-          <w:b/>
-          <w:spacing w:val="-2"/>
-        </w:rPr>
-        <w:t xml:space="preserve">        </w:t>
-      </w:r>
-      <w:proofErr w:type="spellStart"/>
-      <w:r>
-        <w:rPr>
-          <w:b/>
-          <w:spacing w:val="-2"/>
-        </w:rPr>
-        <w:t>quiz.showResult</w:t>
-      </w:r>
-      <w:proofErr w:type="spellEnd"/>
-      <w:r>
-        <w:rPr>
-          <w:b/>
-          <w:spacing w:val="-2"/>
-        </w:rPr>
-        <w:t>();</w:t>
-      </w:r>
-    </w:p>
-    <w:p>
-      <w:pPr>
-        <w:pStyle w:val="BodyText"/>
-        <w:spacing w:before="319"/>
-        <w:rPr>
-          <w:b/>
-          <w:spacing w:val="-2"/>
-        </w:rPr>
-      </w:pPr>
-      <w:r>
-        <w:rPr>
-          <w:b/>
-          <w:spacing w:val="-2"/>
-        </w:rPr>
-        <w:t xml:space="preserve">    }</w:t>
-      </w:r>
-    </w:p>
-    <w:p>
-      <w:pPr>
-        <w:pStyle w:val="BodyText"/>
-        <w:spacing w:before="319"/>
-        <w:rPr>
-          <w:b/>
-          <w:spacing w:val="-2"/>
-        </w:rPr>
-      </w:pPr>
-      <w:r>
-        <w:rPr>
-          <w:b/>
-          <w:spacing w:val="-2"/>
-        </w:rPr>
-        <w:t>};</w:t>
-      </w:r>
-    </w:p>
-    <w:p>
-      <w:pPr>
-        <w:pStyle w:val="BodyText"/>
-        <w:spacing w:before="319"/>
-        <w:rPr>
-          <w:b/>
-          <w:spacing w:val="-2"/>
-        </w:rPr>
-      </w:pPr>
-      <w:r>
-        <w:rPr>
-          <w:b/>
-          <w:spacing w:val="-2"/>
-        </w:rPr>
-        <w:t>int main() {  // Main Function</w:t>
-      </w:r>
-    </w:p>
-    <w:p>
-      <w:pPr>
-        <w:pStyle w:val="BodyText"/>
-        <w:spacing w:before="319"/>
-        <w:rPr>
-          <w:b/>
-          <w:spacing w:val="-2"/>
-        </w:rPr>
-      </w:pPr>
-      <w:r>
-        <w:rPr>
-          <w:b/>
-          <w:spacing w:val="-2"/>
-        </w:rPr>
-        <w:t xml:space="preserve">    User </w:t>
-      </w:r>
-      <w:proofErr w:type="spellStart"/>
-      <w:r>
-        <w:rPr>
-          <w:b/>
-          <w:spacing w:val="-2"/>
-        </w:rPr>
-        <w:t>user</w:t>
-      </w:r>
-      <w:proofErr w:type="spellEnd"/>
-      <w:r>
-        <w:rPr>
-          <w:b/>
-          <w:spacing w:val="-2"/>
-        </w:rPr>
-        <w:t>;</w:t>
-      </w:r>
-    </w:p>
-    <w:p>
-      <w:pPr>
-        <w:pStyle w:val="BodyText"/>
-        <w:spacing w:before="319"/>
-        <w:rPr>
-          <w:b/>
-          <w:spacing w:val="-2"/>
-        </w:rPr>
-      </w:pPr>
-      <w:r>
-        <w:rPr>
-          <w:b/>
-          <w:spacing w:val="-2"/>
-        </w:rPr>
-        <w:t xml:space="preserve">    </w:t>
-      </w:r>
-      <w:proofErr w:type="spellStart"/>
-      <w:r>
-        <w:rPr>
-          <w:b/>
-          <w:spacing w:val="-2"/>
-        </w:rPr>
-        <w:t>user.start</w:t>
-      </w:r>
-      <w:proofErr w:type="spellEnd"/>
-      <w:r>
-        <w:rPr>
-          <w:b/>
-          <w:spacing w:val="-2"/>
-        </w:rPr>
-        <w:t>();</w:t>
-      </w:r>
-    </w:p>
-    <w:p>
-      <w:pPr>
-        <w:pStyle w:val="BodyText"/>
-        <w:spacing w:before="319"/>
-        <w:rPr>
-          <w:b/>
-          <w:spacing w:val="-2"/>
-        </w:rPr>
-      </w:pPr>
-      <w:r>
-        <w:rPr>
-          <w:b/>
-          <w:spacing w:val="-2"/>
-        </w:rPr>
         <w:t xml:space="preserve">    return 0;</w:t>
       </w:r>
     </w:p>
@@ -5608,7 +6173,6 @@
           <w:spacing w:val="-2"/>
           <w:lang w:val="en-IN"/>
         </w:rPr>
-        <w:lastRenderedPageBreak/>
         <w:t>6. Output</w:t>
       </w:r>
     </w:p>
@@ -5714,28 +6278,18 @@
           <w:lang w:val="en-IN"/>
         </w:rPr>
       </w:pPr>
-    </w:p>
-    <w:p>
-      <w:pPr>
-        <w:pStyle w:val="BodyText"/>
-        <w:spacing w:before="319"/>
-        <w:rPr>
-          <w:b/>
-          <w:spacing w:val="-2"/>
-          <w:lang w:val="en-IN"/>
-        </w:rPr>
-      </w:pPr>
-      <w:r>
-        <w:rPr>
-          <w:b/>
+      <w:r>
+        <w:rPr>
+          <w:b/>
+          <w:noProof/>
           <w:spacing w:val="-2"/>
           <w:lang w:val="en-IN"/>
         </w:rPr>
         <w:drawing>
-          <wp:inline distT="0" distB="0" distL="0" distR="0" wp14:anchorId="259363B6" wp14:editId="23ED9A33">
-            <wp:extent cx="6062662" cy="3829050"/>
+          <wp:inline distT="0" distB="0" distL="0" distR="0" wp14:anchorId="6BDEC905" wp14:editId="13EBD085">
+            <wp:extent cx="3945661" cy="5915025"/>
             <wp:effectExtent l="0" t="0" r="0" b="0"/>
-            <wp:docPr id="1827199454" name="Picture 1"/>
+            <wp:docPr id="554598014" name="Picture 1"/>
             <wp:cNvGraphicFramePr>
               <a:graphicFrameLocks xmlns:a="http://schemas.openxmlformats.org/drawingml/2006/main" noChangeAspect="1"/>
             </wp:cNvGraphicFramePr>
@@ -5743,23 +6297,36 @@
               <a:graphicData uri="http://schemas.openxmlformats.org/drawingml/2006/picture">
                 <pic:pic xmlns:pic="http://schemas.openxmlformats.org/drawingml/2006/picture">
                   <pic:nvPicPr>
-                    <pic:cNvPr id="1827199454" name=""/>
-                    <pic:cNvPicPr/>
+                    <pic:cNvPr id="0" name="Picture 1"/>
+                    <pic:cNvPicPr>
+                      <a:picLocks noChangeAspect="1" noChangeArrowheads="1"/>
+                    </pic:cNvPicPr>
                   </pic:nvPicPr>
                   <pic:blipFill>
-                    <a:blip r:embed="rId9"/>
+                    <a:blip r:embed="rId9">
+                      <a:extLst>
+                        <a:ext uri="{28A0092B-C50C-407E-A947-70E740481C1C}">
+                          <a14:useLocalDpi xmlns:a14="http://schemas.microsoft.com/office/drawing/2010/main" val="0"/>
+                        </a:ext>
+                      </a:extLst>
+                    </a:blip>
+                    <a:srcRect/>
                     <a:stretch>
                       <a:fillRect/>
                     </a:stretch>
                   </pic:blipFill>
-                  <pic:spPr>
+                  <pic:spPr bwMode="auto">
                     <a:xfrm>
                       <a:off x="0" y="0"/>
-                      <a:ext cx="6063293" cy="3829449"/>
+                      <a:ext cx="3957584" cy="5932899"/>
                     </a:xfrm>
                     <a:prstGeom prst="rect">
                       <a:avLst/>
                     </a:prstGeom>
+                    <a:noFill/>
+                    <a:ln>
+                      <a:noFill/>
+                    </a:ln>
                   </pic:spPr>
                 </pic:pic>
               </a:graphicData>
@@ -5847,61 +6414,6 @@
         <w:spacing w:before="319"/>
         <w:rPr>
           <w:b/>
-          <w:spacing w:val="-2"/>
-          <w:lang w:val="en-IN"/>
-        </w:rPr>
-      </w:pPr>
-    </w:p>
-    <w:p>
-      <w:pPr>
-        <w:pStyle w:val="BodyText"/>
-        <w:spacing w:before="319"/>
-        <w:rPr>
-          <w:b/>
-          <w:spacing w:val="-2"/>
-          <w:lang w:val="en-IN"/>
-        </w:rPr>
-      </w:pPr>
-    </w:p>
-    <w:p>
-      <w:pPr>
-        <w:pStyle w:val="BodyText"/>
-        <w:spacing w:before="319"/>
-        <w:rPr>
-          <w:b/>
-          <w:spacing w:val="-2"/>
-          <w:lang w:val="en-IN"/>
-        </w:rPr>
-      </w:pPr>
-    </w:p>
-    <w:p>
-      <w:pPr>
-        <w:pStyle w:val="BodyText"/>
-        <w:spacing w:before="319"/>
-        <w:rPr>
-          <w:b/>
-          <w:spacing w:val="-2"/>
-          <w:lang w:val="en-IN"/>
-        </w:rPr>
-      </w:pPr>
-    </w:p>
-    <w:p>
-      <w:pPr>
-        <w:pStyle w:val="BodyText"/>
-        <w:spacing w:before="319"/>
-        <w:rPr>
-          <w:b/>
-          <w:spacing w:val="-2"/>
-          <w:lang w:val="en-IN"/>
-        </w:rPr>
-      </w:pPr>
-    </w:p>
-    <w:p>
-      <w:pPr>
-        <w:pStyle w:val="BodyText"/>
-        <w:spacing w:before="319"/>
-        <w:rPr>
-          <w:b/>
           <w:bCs/>
           <w:spacing w:val="-2"/>
           <w:lang w:val="en-IN"/>
@@ -6024,6 +6536,189 @@
       <w:pPr>
         <w:pStyle w:val="BodyText"/>
         <w:spacing w:before="319"/>
+        <w:rPr>
+          <w:b/>
+          <w:spacing w:val="-2"/>
+          <w:lang w:val="en-IN"/>
+        </w:rPr>
+      </w:pPr>
+      <w:r>
+        <w:rPr>
+          <w:b/>
+          <w:spacing w:val="-2"/>
+          <w:lang w:val="en-IN"/>
+        </w:rPr>
+        <w:t>REFERENCES</w:t>
+      </w:r>
+    </w:p>
+    <w:p>
+      <w:pPr>
+        <w:pStyle w:val="BodyText"/>
+        <w:numPr>
+          <w:ilvl w:val="0"/>
+          <w:numId w:val="14"/>
+        </w:numPr>
+        <w:spacing w:before="319"/>
+        <w:rPr>
+          <w:b/>
+          <w:spacing w:val="-2"/>
+          <w:lang w:val="en-IN"/>
+        </w:rPr>
+      </w:pPr>
+      <w:r>
+        <w:rPr>
+          <w:b/>
+          <w:spacing w:val="-2"/>
+          <w:lang w:val="en-IN"/>
+        </w:rPr>
+        <w:t>GeeksforGeeks.com</w:t>
+      </w:r>
+    </w:p>
+    <w:p>
+      <w:pPr>
+        <w:pStyle w:val="BodyText"/>
+        <w:numPr>
+          <w:ilvl w:val="0"/>
+          <w:numId w:val="14"/>
+        </w:numPr>
+        <w:spacing w:before="319"/>
+        <w:rPr>
+          <w:b/>
+          <w:spacing w:val="-2"/>
+          <w:lang w:val="en-IN"/>
+        </w:rPr>
+      </w:pPr>
+      <w:r>
+        <w:rPr>
+          <w:b/>
+          <w:spacing w:val="-2"/>
+          <w:lang w:val="en-IN"/>
+        </w:rPr>
+        <w:t xml:space="preserve">Reference materials from existing quiz apps </w:t>
+      </w:r>
+    </w:p>
+    <w:p>
+      <w:pPr>
+        <w:pStyle w:val="BodyText"/>
+        <w:numPr>
+          <w:ilvl w:val="0"/>
+          <w:numId w:val="14"/>
+        </w:numPr>
+        <w:spacing w:before="319"/>
+        <w:rPr>
+          <w:b/>
+          <w:spacing w:val="-2"/>
+          <w:lang w:val="en-IN"/>
+        </w:rPr>
+      </w:pPr>
+      <w:r>
+        <w:rPr>
+          <w:b/>
+          <w:spacing w:val="-2"/>
+          <w:lang w:val="en-IN"/>
+        </w:rPr>
+        <w:t xml:space="preserve">Basic git and static data input using STEP </w:t>
+      </w:r>
+    </w:p>
+    <w:p>
+      <w:pPr>
+        <w:pStyle w:val="BodyText"/>
+        <w:numPr>
+          <w:ilvl w:val="0"/>
+          <w:numId w:val="14"/>
+        </w:numPr>
+        <w:spacing w:before="319"/>
+        <w:rPr>
+          <w:b/>
+          <w:spacing w:val="-2"/>
+          <w:lang w:val="en-IN"/>
+        </w:rPr>
+      </w:pPr>
+      <w:r>
+        <w:rPr>
+          <w:b/>
+          <w:spacing w:val="-2"/>
+          <w:lang w:val="en-IN"/>
+        </w:rPr>
+        <w:t>W3Schools.com</w:t>
+      </w:r>
+    </w:p>
+    <w:p>
+      <w:pPr>
+        <w:pStyle w:val="BodyText"/>
+        <w:numPr>
+          <w:ilvl w:val="0"/>
+          <w:numId w:val="14"/>
+        </w:numPr>
+        <w:spacing w:before="319"/>
+        <w:rPr>
+          <w:b/>
+          <w:spacing w:val="-2"/>
+          <w:lang w:val="en-IN"/>
+        </w:rPr>
+      </w:pPr>
+      <w:r>
+        <w:rPr>
+          <w:b/>
+          <w:spacing w:val="-2"/>
+          <w:lang w:val="en-IN"/>
+        </w:rPr>
+        <w:t>Github.com</w:t>
+      </w:r>
+    </w:p>
+    <w:p>
+      <w:pPr>
+        <w:pStyle w:val="BodyText"/>
+        <w:spacing w:before="319"/>
+        <w:ind w:left="720"/>
+        <w:rPr>
+          <w:b/>
+          <w:spacing w:val="-2"/>
+          <w:lang w:val="en-IN"/>
+        </w:rPr>
+      </w:pPr>
+    </w:p>
+    <w:p>
+      <w:pPr>
+        <w:pStyle w:val="BodyText"/>
+        <w:spacing w:before="319"/>
+        <w:ind w:left="720"/>
+        <w:rPr>
+          <w:b/>
+          <w:spacing w:val="-2"/>
+          <w:lang w:val="en-IN"/>
+        </w:rPr>
+      </w:pPr>
+    </w:p>
+    <w:p>
+      <w:pPr>
+        <w:pStyle w:val="BodyText"/>
+        <w:spacing w:before="319"/>
+        <w:ind w:left="720"/>
+        <w:rPr>
+          <w:b/>
+          <w:spacing w:val="-2"/>
+          <w:lang w:val="en-IN"/>
+        </w:rPr>
+      </w:pPr>
+    </w:p>
+    <w:p>
+      <w:pPr>
+        <w:pStyle w:val="BodyText"/>
+        <w:spacing w:before="319"/>
+        <w:ind w:left="720"/>
+        <w:jc w:val="center"/>
+        <w:rPr>
+          <w:b/>
+          <w:spacing w:val="-2"/>
+          <w:lang w:val="en-IN"/>
+        </w:rPr>
+      </w:pPr>
+    </w:p>
+    <w:p>
+      <w:pPr>
+        <w:pStyle w:val="BodyText"/>
+        <w:spacing w:before="319"/>
         <w:jc w:val="center"/>
         <w:rPr>
           <w:b/>
@@ -6041,8 +6736,40 @@
           <w:szCs w:val="48"/>
           <w:lang w:val="en-IN"/>
         </w:rPr>
-        <w:t>THANK YOU!</w:t>
-      </w:r>
+        <w:t xml:space="preserve">THANK </w:t>
+      </w:r>
+      <w:proofErr w:type="gramStart"/>
+      <w:r>
+        <w:rPr>
+          <w:b/>
+          <w:spacing w:val="-2"/>
+          <w:sz w:val="48"/>
+          <w:szCs w:val="48"/>
+          <w:lang w:val="en-IN"/>
+        </w:rPr>
+        <w:t>YOU</w:t>
+      </w:r>
+      <w:r>
+        <w:rPr>
+          <w:b/>
+          <w:spacing w:val="-2"/>
+          <w:sz w:val="48"/>
+          <w:szCs w:val="48"/>
+          <w:lang w:val="en-IN"/>
+        </w:rPr>
+        <w:t xml:space="preserve"> </w:t>
+      </w:r>
+      <w:r>
+        <w:rPr>
+          <w:b/>
+          <w:spacing w:val="-2"/>
+          <w:sz w:val="48"/>
+          <w:szCs w:val="48"/>
+          <w:lang w:val="en-IN"/>
+        </w:rPr>
+        <w:t>!</w:t>
+      </w:r>
+      <w:proofErr w:type="gramEnd"/>
     </w:p>
     <w:p>
       <w:pPr>
@@ -7241,6 +7968,92 @@
     </w:lvl>
   </w:abstractNum>
   <w:abstractNum w:abstractNumId="9" w15:restartNumberingAfterBreak="0">
+    <w:nsid w:val="581742F9"/>
+    <w:multiLevelType w:val="hybridMultilevel"/>
+    <w:tmpl w:val="F77CE238"/>
+    <w:lvl w:ilvl="0" w:tplc="4009000F">
+      <w:start w:val="1"/>
+      <w:numFmt w:val="decimal"/>
+      <w:lvlText w:val="%1."/>
+      <w:lvlJc w:val="left"/>
+      <w:pPr>
+        <w:ind w:left="720" w:hanging="360"/>
+      </w:pPr>
+    </w:lvl>
+    <w:lvl w:ilvl="1" w:tplc="40090019" w:tentative="1">
+      <w:start w:val="1"/>
+      <w:numFmt w:val="lowerLetter"/>
+      <w:lvlText w:val="%2."/>
+      <w:lvlJc w:val="left"/>
+      <w:pPr>
+        <w:ind w:left="1440" w:hanging="360"/>
+      </w:pPr>
+    </w:lvl>
+    <w:lvl w:ilvl="2" w:tplc="4009001B" w:tentative="1">
+      <w:start w:val="1"/>
+      <w:numFmt w:val="lowerRoman"/>
+      <w:lvlText w:val="%3."/>
+      <w:lvlJc w:val="right"/>
+      <w:pPr>
+        <w:ind w:left="2160" w:hanging="180"/>
+      </w:pPr>
+    </w:lvl>
+    <w:lvl w:ilvl="3" w:tplc="4009000F" w:tentative="1">
+      <w:start w:val="1"/>
+      <w:numFmt w:val="decimal"/>
+      <w:lvlText w:val="%4."/>
+      <w:lvlJc w:val="left"/>
+      <w:pPr>
+        <w:ind w:left="2880" w:hanging="360"/>
+      </w:pPr>
+    </w:lvl>
+    <w:lvl w:ilvl="4" w:tplc="40090019" w:tentative="1">
+      <w:start w:val="1"/>
+      <w:numFmt w:val="lowerLetter"/>
+      <w:lvlText w:val="%5."/>
+      <w:lvlJc w:val="left"/>
+      <w:pPr>
+        <w:ind w:left="3600" w:hanging="360"/>
+      </w:pPr>
+    </w:lvl>
+    <w:lvl w:ilvl="5" w:tplc="4009001B" w:tentative="1">
+      <w:start w:val="1"/>
+      <w:numFmt w:val="lowerRoman"/>
+      <w:lvlText w:val="%6."/>
+      <w:lvlJc w:val="right"/>
+      <w:pPr>
+        <w:ind w:left="4320" w:hanging="180"/>
+      </w:pPr>
+    </w:lvl>
+    <w:lvl w:ilvl="6" w:tplc="4009000F" w:tentative="1">
+      <w:start w:val="1"/>
+      <w:numFmt w:val="decimal"/>
+      <w:lvlText w:val="%7."/>
+      <w:lvlJc w:val="left"/>
+      <w:pPr>
+        <w:ind w:left="5040" w:hanging="360"/>
+      </w:pPr>
+    </w:lvl>
+    <w:lvl w:ilvl="7" w:tplc="40090019" w:tentative="1">
+      <w:start w:val="1"/>
+      <w:numFmt w:val="lowerLetter"/>
+      <w:lvlText w:val="%8."/>
+      <w:lvlJc w:val="left"/>
+      <w:pPr>
+        <w:ind w:left="5760" w:hanging="360"/>
+      </w:pPr>
+    </w:lvl>
+    <w:lvl w:ilvl="8" w:tplc="4009001B" w:tentative="1">
+      <w:start w:val="1"/>
+      <w:numFmt w:val="lowerRoman"/>
+      <w:lvlText w:val="%9."/>
+      <w:lvlJc w:val="right"/>
+      <w:pPr>
+        <w:ind w:left="6480" w:hanging="180"/>
+      </w:pPr>
+    </w:lvl>
+  </w:abstractNum>
+  <w:abstractNum w:abstractNumId="10" w15:restartNumberingAfterBreak="0">
     <w:nsid w:val="6290766A"/>
     <w:multiLevelType w:val="hybridMultilevel"/>
     <w:tmpl w:val="AEDCB7E4"/>
@@ -7351,7 +8164,7 @@
       </w:rPr>
     </w:lvl>
   </w:abstractNum>
-  <w:abstractNum w:abstractNumId="10" w15:restartNumberingAfterBreak="0">
+  <w:abstractNum w:abstractNumId="11" w15:restartNumberingAfterBreak="0">
     <w:nsid w:val="67E9133B"/>
     <w:multiLevelType w:val="multilevel"/>
     <w:tmpl w:val="DDA0EC92"/>
@@ -7464,7 +8277,7 @@
       </w:pPr>
     </w:lvl>
   </w:abstractNum>
-  <w:abstractNum w:abstractNumId="11" w15:restartNumberingAfterBreak="0">
+  <w:abstractNum w:abstractNumId="12" w15:restartNumberingAfterBreak="0">
     <w:nsid w:val="6DE53F3D"/>
     <w:multiLevelType w:val="multilevel"/>
     <w:tmpl w:val="A2C4A046"/>
@@ -7613,7 +8426,7 @@
       </w:rPr>
     </w:lvl>
   </w:abstractNum>
-  <w:abstractNum w:abstractNumId="12" w15:restartNumberingAfterBreak="0">
+  <w:abstractNum w:abstractNumId="13" w15:restartNumberingAfterBreak="0">
     <w:nsid w:val="77320F28"/>
     <w:multiLevelType w:val="multilevel"/>
     <w:tmpl w:val="3976E906"/>
@@ -7763,7 +8576,7 @@
     </w:lvl>
   </w:abstractNum>
   <w:num w:numId="1" w16cid:durableId="1672682413">
-    <w:abstractNumId w:val="9"/>
+    <w:abstractNumId w:val="10"/>
   </w:num>
   <w:num w:numId="2" w16cid:durableId="1008872650">
     <w:abstractNumId w:val="8"/>
@@ -7778,7 +8591,7 @@
     <w:abstractNumId w:val="4"/>
   </w:num>
   <w:num w:numId="6" w16cid:durableId="642849849">
-    <w:abstractNumId w:val="10"/>
+    <w:abstractNumId w:val="11"/>
   </w:num>
   <w:num w:numId="7" w16cid:durableId="1818570921">
     <w:abstractNumId w:val="3"/>
@@ -7790,16 +8603,19 @@
     <w:abstractNumId w:val="0"/>
   </w:num>
   <w:num w:numId="10" w16cid:durableId="484056984">
-    <w:abstractNumId w:val="12"/>
+    <w:abstractNumId w:val="13"/>
   </w:num>
   <w:num w:numId="11" w16cid:durableId="748621852">
     <w:abstractNumId w:val="1"/>
   </w:num>
   <w:num w:numId="12" w16cid:durableId="200868821">
-    <w:abstractNumId w:val="11"/>
+    <w:abstractNumId w:val="12"/>
   </w:num>
   <w:num w:numId="13" w16cid:durableId="53242361">
     <w:abstractNumId w:val="5"/>
+  </w:num>
+  <w:num w:numId="14" w16cid:durableId="757563285">
+    <w:abstractNumId w:val="9"/>
   </w:num>
 </w:numbering>
 </file>
@@ -8211,7 +9027,6 @@
   <w:style w:type="character" w:default="1" w:styleId="DefaultParagraphFont">
     <w:name w:val="Default Paragraph Font"/>
     <w:uiPriority w:val="1"/>
-    <w:semiHidden/>
     <w:unhideWhenUsed/>
   </w:style>
   <w:style w:type="table" w:default="1" w:styleId="TableNormal">

</xml_diff>